<commit_message>
Correct team details for Lab 1
</commit_message>
<xml_diff>
--- a/Requirements_Table_Google_Docs_Ready.docx
+++ b/Requirements_Table_Google_Docs_Ready.docx
@@ -31,10 +31,7 @@
         <w:jc w:val="center"/>
       </w:pPr>
       <w:r>
-        <w:rPr>
-          <w:sz w:val="20"/>
-        </w:rPr>
-        <w:t>Nishitha S  |  PES1UG24AM180  |  Problem Statement #13</w:t>
+        <w:t>M P Shashank | PES1UG24AM160  •  Narayanan Arun | PES1UG24AM172  •  Nishanth N | PES1UG24AM179  •  Nishitha S | PES1UG24AM180  |  Problem Statement #13</w:t>
       </w:r>
     </w:p>
     <w:p>

</xml_diff>